<commit_message>
Add public web app with auth and payments
</commit_message>
<xml_diff>
--- a/templates/chief_of_staff.docx
+++ b/templates/chief_of_staff.docx
@@ -1552,42 +1552,11 @@
       <w:r>
         <w:rPr>
           <w:rFonts w:ascii="Verdana" w:eastAsia="Verdana" w:hAnsi="Verdana" w:cs="Verdana"/>
-          <w:b w:val="0"/>
           <w:bCs/>
           <w:sz w:val="16"/>
           <w:szCs w:val="16"/>
         </w:rPr>
         <w:t xml:space="preserve"> Authored fundraising materials and executive briefings for senior stakeholders; led documentation for VC third-fund raise achieving oversubscribed £40M close</w:t>
-      </w:r>
-      <w:r>
-        <w:rPr>
-          <w:rFonts w:ascii="Verdana" w:eastAsia="Verdana" w:hAnsi="Verdana" w:cs="Verdana"/>
-          <w:b/>
-          <w:bCs/>
-          <w:sz w:val="16"/>
-          <w:szCs w:val="16"/>
-        </w:rPr>
-      </w:r>
-      <w:r>
-        <w:rPr>
-          <w:rFonts w:ascii="Verdana" w:eastAsia="Verdana" w:hAnsi="Verdana" w:cs="Verdana"/>
-          <w:sz w:val="16"/>
-          <w:szCs w:val="16"/>
-        </w:rPr>
-      </w:r>
-      <w:r>
-        <w:rPr>
-          <w:rFonts w:ascii="Verdana" w:eastAsia="Verdana" w:hAnsi="Verdana" w:cs="Verdana"/>
-          <w:sz w:val="16"/>
-          <w:szCs w:val="16"/>
-        </w:rPr>
-      </w:r>
-      <w:r>
-        <w:rPr>
-          <w:rFonts w:ascii="Verdana" w:eastAsia="Verdana" w:hAnsi="Verdana" w:cs="Verdana"/>
-          <w:sz w:val="16"/>
-          <w:szCs w:val="16"/>
-        </w:rPr>
       </w:r>
     </w:p>
     <w:p>
@@ -1617,42 +1586,11 @@
       <w:r>
         <w:rPr>
           <w:rFonts w:ascii="Verdana" w:eastAsia="Verdana" w:hAnsi="Verdana" w:cs="Verdana"/>
-          <w:b w:val="0"/>
           <w:bCs/>
           <w:sz w:val="16"/>
           <w:szCs w:val="16"/>
         </w:rPr>
         <w:t xml:space="preserve"> Brokered introductions to 4 partner firms and co-ordinated multi-party deal teams across legal, finance and advisory functions to facilitate a £13M cash-shell IPO</w:t>
-      </w:r>
-      <w:r>
-        <w:rPr>
-          <w:rFonts w:ascii="Verdana" w:eastAsia="Verdana" w:hAnsi="Verdana" w:cs="Verdana"/>
-          <w:b/>
-          <w:bCs/>
-          <w:sz w:val="16"/>
-          <w:szCs w:val="16"/>
-        </w:rPr>
-      </w:r>
-      <w:r>
-        <w:rPr>
-          <w:rFonts w:ascii="Verdana" w:eastAsia="Verdana" w:hAnsi="Verdana" w:cs="Verdana"/>
-          <w:sz w:val="16"/>
-          <w:szCs w:val="16"/>
-        </w:rPr>
-      </w:r>
-      <w:r>
-        <w:rPr>
-          <w:rFonts w:ascii="Verdana" w:eastAsia="Verdana" w:hAnsi="Verdana" w:cs="Verdana"/>
-          <w:sz w:val="16"/>
-          <w:szCs w:val="16"/>
-        </w:rPr>
-      </w:r>
-      <w:r>
-        <w:rPr>
-          <w:rFonts w:ascii="Verdana" w:eastAsia="Verdana" w:hAnsi="Verdana" w:cs="Verdana"/>
-          <w:sz w:val="16"/>
-          <w:szCs w:val="16"/>
-        </w:rPr>
       </w:r>
     </w:p>
     <w:p>
@@ -1682,25 +1620,10 @@
       <w:r>
         <w:rPr>
           <w:rFonts w:ascii="Verdana" w:eastAsia="Verdana" w:hAnsi="Verdana" w:cs="Verdana"/>
-          <w:b w:val="0"/>
           <w:sz w:val="16"/>
           <w:szCs w:val="16"/>
         </w:rPr>
         <w:t xml:space="preserve"> Designed and implemented a company-wide CRM and document management system from scratch, driving a 50% increase in relationship re-engagements and 3 new mandates</w:t>
-      </w:r>
-      <w:r>
-        <w:rPr>
-          <w:rFonts w:ascii="Verdana" w:eastAsia="Verdana" w:hAnsi="Verdana" w:cs="Verdana"/>
-          <w:sz w:val="16"/>
-          <w:szCs w:val="16"/>
-        </w:rPr>
-      </w:r>
-      <w:r>
-        <w:rPr>
-          <w:rFonts w:ascii="Verdana" w:eastAsia="Verdana" w:hAnsi="Verdana" w:cs="Verdana"/>
-          <w:sz w:val="16"/>
-          <w:szCs w:val="16"/>
-        </w:rPr>
       </w:r>
     </w:p>
     <w:p>
@@ -1805,7 +1728,6 @@
                 <w:szCs w:val="16"/>
               </w:rPr>
             </w:pPr>
-            <w:proofErr w:type="spellStart"/>
             <w:r>
               <w:rPr>
                 <w:rFonts w:ascii="Verdana" w:eastAsia="Verdana" w:hAnsi="Verdana" w:cs="Verdana"/>
@@ -1816,7 +1738,6 @@
               </w:rPr>
               <w:t>Winkreative</w:t>
             </w:r>
-            <w:proofErr w:type="spellEnd"/>
           </w:p>
         </w:tc>
         <w:tc>
@@ -1948,7 +1869,6 @@
                 <w:szCs w:val="16"/>
               </w:rPr>
             </w:pPr>
-            <w:proofErr w:type="spellStart"/>
             <w:r>
               <w:rPr>
                 <w:rFonts w:ascii="Verdana" w:eastAsia="Verdana" w:hAnsi="Verdana" w:cs="Verdana"/>
@@ -1957,40 +1877,7 @@
                 <w:sz w:val="16"/>
                 <w:szCs w:val="16"/>
               </w:rPr>
-              <w:t>Winkreative</w:t>
-            </w:r>
-            <w:proofErr w:type="spellEnd"/>
-            <w:r>
-              <w:rPr>
-                <w:rFonts w:ascii="Verdana" w:eastAsia="Verdana" w:hAnsi="Verdana" w:cs="Verdana"/>
-                <w:i/>
-                <w:iCs/>
-                <w:sz w:val="16"/>
-                <w:szCs w:val="16"/>
-              </w:rPr>
-              <w:t xml:space="preserve"> is a global creative agency </w:t>
-            </w:r>
-            <w:proofErr w:type="spellStart"/>
-            <w:r>
-              <w:rPr>
-                <w:rFonts w:ascii="Verdana" w:eastAsia="Verdana" w:hAnsi="Verdana" w:cs="Verdana"/>
-                <w:i/>
-                <w:iCs/>
-                <w:sz w:val="16"/>
-                <w:szCs w:val="16"/>
-              </w:rPr>
-              <w:t>specialising</w:t>
-            </w:r>
-            <w:proofErr w:type="spellEnd"/>
-            <w:r>
-              <w:rPr>
-                <w:rFonts w:ascii="Verdana" w:eastAsia="Verdana" w:hAnsi="Verdana" w:cs="Verdana"/>
-                <w:i/>
-                <w:iCs/>
-                <w:sz w:val="16"/>
-                <w:szCs w:val="16"/>
-              </w:rPr>
-              <w:t xml:space="preserve"> in strategy and design across branding, experiences and communications</w:t>
+              <w:t>Winkreative is a global creative agency specialising in strategy and design across branding, experiences and communications</w:t>
             </w:r>
           </w:p>
         </w:tc>
@@ -2199,17 +2086,7 @@
           <w:sz w:val="16"/>
           <w:szCs w:val="16"/>
         </w:rPr>
-        <w:t>Programme Management:</w:t>
-      </w:r>
-      <w:r>
-        <w:rPr>
-          <w:rFonts w:ascii="Verdana" w:eastAsia="Verdana" w:hAnsi="Verdana" w:cs="Verdana"/>
-          <w:b w:val="0"/>
-          <w:bCs/>
-          <w:sz w:val="16"/>
-          <w:szCs w:val="16"/>
-        </w:rPr>
-        <w:t xml:space="preserve"> Managed budgets up to £800K and led cross-functional teams of 6–8 across design, tech and strategy to deliver complex multi-channel client programmes on time and within brief</w:t>
+        <w:t>Project</w:t>
       </w:r>
       <w:r>
         <w:rPr>
@@ -2219,55 +2096,16 @@
           <w:sz w:val="16"/>
           <w:szCs w:val="16"/>
         </w:rPr>
-      </w:r>
-      <w:r>
-        <w:rPr>
-          <w:rFonts w:ascii="Verdana" w:eastAsia="Verdana" w:hAnsi="Verdana" w:cs="Verdana"/>
-          <w:sz w:val="16"/>
-          <w:szCs w:val="16"/>
-        </w:rPr>
-      </w:r>
-      <w:r>
-        <w:rPr>
-          <w:rFonts w:ascii="Verdana" w:eastAsia="Verdana" w:hAnsi="Verdana" w:cs="Verdana"/>
-          <w:sz w:val="16"/>
-          <w:szCs w:val="16"/>
-        </w:rPr>
-      </w:r>
-      <w:r>
-        <w:rPr>
-          <w:rFonts w:ascii="Verdana" w:eastAsia="Verdana" w:hAnsi="Verdana" w:cs="Verdana"/>
-          <w:sz w:val="16"/>
-          <w:szCs w:val="16"/>
-        </w:rPr>
-      </w:r>
-      <w:r>
-        <w:rPr>
-          <w:rFonts w:ascii="Verdana" w:eastAsia="Verdana" w:hAnsi="Verdana" w:cs="Verdana"/>
-          <w:sz w:val="16"/>
-          <w:szCs w:val="16"/>
-        </w:rPr>
-      </w:r>
-      <w:r>
-        <w:rPr>
-          <w:rFonts w:ascii="Verdana" w:eastAsia="Verdana" w:hAnsi="Verdana" w:cs="Verdana"/>
-          <w:sz w:val="16"/>
-          <w:szCs w:val="16"/>
-        </w:rPr>
-      </w:r>
-      <w:r>
-        <w:rPr>
-          <w:rFonts w:ascii="Verdana" w:eastAsia="Verdana" w:hAnsi="Verdana" w:cs="Verdana"/>
-          <w:sz w:val="16"/>
-          <w:szCs w:val="16"/>
-        </w:rPr>
-      </w:r>
-      <w:r>
-        <w:rPr>
-          <w:rFonts w:ascii="Verdana" w:eastAsia="Verdana" w:hAnsi="Verdana" w:cs="Verdana"/>
-          <w:sz w:val="16"/>
-          <w:szCs w:val="16"/>
-        </w:rPr>
+        <w:t xml:space="preserve"> Management:</w:t>
+      </w:r>
+      <w:r>
+        <w:rPr>
+          <w:rFonts w:ascii="Verdana" w:eastAsia="Verdana" w:hAnsi="Verdana" w:cs="Verdana"/>
+          <w:bCs/>
+          <w:sz w:val="16"/>
+          <w:szCs w:val="16"/>
+        </w:rPr>
+        <w:t xml:space="preserve"> Managed budgets up to £800K and led cross-functional teams of 6–8 across design, tech and strategy to deliver complex multi-channel client programmes on time and within brief</w:t>
       </w:r>
     </w:p>
     <w:p>
@@ -2302,7 +2140,6 @@
         </w:rPr>
         <w:t xml:space="preserve"> </w:t>
       </w:r>
-      <w:proofErr w:type="gramStart"/>
       <w:r>
         <w:rPr>
           <w:rFonts w:ascii="Verdana" w:eastAsia="Verdana" w:hAnsi="Verdana" w:cs="Verdana"/>
@@ -2317,16 +2154,7 @@
           <w:sz w:val="16"/>
           <w:szCs w:val="16"/>
         </w:rPr>
-        <w:t>p-sold</w:t>
-      </w:r>
-      <w:proofErr w:type="gramEnd"/>
-      <w:r>
-        <w:rPr>
-          <w:rFonts w:ascii="Verdana" w:eastAsia="Verdana" w:hAnsi="Verdana" w:cs="Verdana"/>
-          <w:sz w:val="16"/>
-          <w:szCs w:val="16"/>
-        </w:rPr>
-        <w:t xml:space="preserve"> £500K of services</w:t>
+        <w:t>p-sold £500K of services</w:t>
       </w:r>
       <w:r>
         <w:rPr>
@@ -2396,7 +2224,6 @@
       <w:r>
         <w:rPr>
           <w:rFonts w:ascii="Verdana" w:eastAsia="Verdana" w:hAnsi="Verdana" w:cs="Verdana"/>
-          <w:b w:val="0"/>
           <w:sz w:val="16"/>
           <w:szCs w:val="16"/>
         </w:rPr>
@@ -2827,42 +2654,11 @@
       <w:r>
         <w:rPr>
           <w:rFonts w:ascii="Verdana" w:eastAsia="Verdana" w:hAnsi="Verdana" w:cs="Verdana"/>
-          <w:b w:val="0"/>
           <w:bCs/>
           <w:sz w:val="16"/>
           <w:szCs w:val="16"/>
         </w:rPr>
         <w:t xml:space="preserve"> Secured £155K angel investment, designed company operating model, and managed financial controls and board reporting as sole founding operator</w:t>
-      </w:r>
-      <w:r>
-        <w:rPr>
-          <w:rFonts w:ascii="Verdana" w:eastAsia="Verdana" w:hAnsi="Verdana" w:cs="Verdana"/>
-          <w:b/>
-          <w:bCs/>
-          <w:sz w:val="16"/>
-          <w:szCs w:val="16"/>
-        </w:rPr>
-      </w:r>
-      <w:r>
-        <w:rPr>
-          <w:rFonts w:ascii="Verdana" w:eastAsia="Verdana" w:hAnsi="Verdana" w:cs="Verdana"/>
-          <w:sz w:val="16"/>
-          <w:szCs w:val="16"/>
-        </w:rPr>
-      </w:r>
-      <w:r>
-        <w:rPr>
-          <w:rFonts w:ascii="Verdana" w:eastAsia="Verdana" w:hAnsi="Verdana" w:cs="Verdana"/>
-          <w:sz w:val="16"/>
-          <w:szCs w:val="16"/>
-        </w:rPr>
-      </w:r>
-      <w:r>
-        <w:rPr>
-          <w:rFonts w:ascii="Verdana" w:eastAsia="Verdana" w:hAnsi="Verdana" w:cs="Verdana"/>
-          <w:sz w:val="16"/>
-          <w:szCs w:val="16"/>
-        </w:rPr>
       </w:r>
     </w:p>
     <w:p>
@@ -2892,7 +2688,6 @@
       <w:r>
         <w:rPr>
           <w:rFonts w:ascii="Verdana" w:eastAsia="Verdana" w:hAnsi="Verdana" w:cs="Verdana"/>
-          <w:b w:val="0"/>
           <w:sz w:val="16"/>
           <w:szCs w:val="16"/>
         </w:rPr>
@@ -2926,25 +2721,10 @@
       <w:r>
         <w:rPr>
           <w:rFonts w:ascii="Verdana" w:eastAsia="Verdana" w:hAnsi="Verdana" w:cs="Verdana"/>
-          <w:b w:val="0"/>
           <w:sz w:val="16"/>
           <w:szCs w:val="16"/>
         </w:rPr>
         <w:t xml:space="preserve"> Translated vision into operational roadmap; coordinated product, marketing and partnerships functions to scale platform to 2,500+ users with minimal resources</w:t>
-      </w:r>
-      <w:r>
-        <w:rPr>
-          <w:rFonts w:ascii="Verdana" w:eastAsia="Verdana" w:hAnsi="Verdana" w:cs="Verdana"/>
-          <w:sz w:val="16"/>
-          <w:szCs w:val="16"/>
-        </w:rPr>
-      </w:r>
-      <w:r>
-        <w:rPr>
-          <w:rFonts w:ascii="Verdana" w:eastAsia="Verdana" w:hAnsi="Verdana" w:cs="Verdana"/>
-          <w:sz w:val="16"/>
-          <w:szCs w:val="16"/>
-        </w:rPr>
       </w:r>
     </w:p>
     <w:p>
@@ -3001,25 +2781,7 @@
           <w:sz w:val="16"/>
           <w:szCs w:val="16"/>
         </w:rPr>
-        <w:t xml:space="preserve">for £50K within 12 months </w:t>
-      </w:r>
-      <w:proofErr w:type="gramStart"/>
-      <w:r>
-        <w:rPr>
-          <w:rFonts w:ascii="Verdana" w:eastAsia="Verdana" w:hAnsi="Verdana" w:cs="Verdana"/>
-          <w:sz w:val="16"/>
-          <w:szCs w:val="16"/>
-        </w:rPr>
-        <w:t>and</w:t>
-      </w:r>
-      <w:proofErr w:type="gramEnd"/>
-      <w:r>
-        <w:rPr>
-          <w:rFonts w:ascii="Verdana" w:eastAsia="Verdana" w:hAnsi="Verdana" w:cs="Verdana"/>
-          <w:sz w:val="16"/>
-          <w:szCs w:val="16"/>
-        </w:rPr>
-        <w:t xml:space="preserve"> iterated </w:t>
+        <w:t xml:space="preserve">for £50K within 12 months and iterated </w:t>
       </w:r>
       <w:r>
         <w:rPr>
@@ -3535,25 +3297,7 @@
           <w:sz w:val="16"/>
           <w:szCs w:val="16"/>
         </w:rPr>
-        <w:t xml:space="preserve"> Secured pro bono contract with leading branding agency, </w:t>
-      </w:r>
-      <w:proofErr w:type="spellStart"/>
-      <w:r>
-        <w:rPr>
-          <w:rFonts w:ascii="Verdana" w:eastAsia="Verdana" w:hAnsi="Verdana" w:cs="Verdana"/>
-          <w:sz w:val="16"/>
-          <w:szCs w:val="16"/>
-        </w:rPr>
-        <w:t>BrandOpus</w:t>
-      </w:r>
-      <w:proofErr w:type="spellEnd"/>
-      <w:r>
-        <w:rPr>
-          <w:rFonts w:ascii="Verdana" w:eastAsia="Verdana" w:hAnsi="Verdana" w:cs="Verdana"/>
-          <w:sz w:val="16"/>
-          <w:szCs w:val="16"/>
-        </w:rPr>
-        <w:t>, to develop brand identity</w:t>
+        <w:t xml:space="preserve"> Secured pro bono contract with leading branding agency, BrandOpus, to develop brand identity</w:t>
       </w:r>
     </w:p>
     <w:p>
@@ -3749,7 +3493,6 @@
           <w:szCs w:val="16"/>
         </w:rPr>
       </w:pPr>
-      <w:proofErr w:type="spellStart"/>
       <w:r>
         <w:rPr>
           <w:rFonts w:ascii="Verdana" w:eastAsia="Verdana" w:hAnsi="Verdana" w:cs="Verdana"/>
@@ -3758,18 +3501,7 @@
           <w:sz w:val="16"/>
           <w:szCs w:val="16"/>
         </w:rPr>
-        <w:t>Sabbatum</w:t>
-      </w:r>
-      <w:proofErr w:type="spellEnd"/>
-      <w:r>
-        <w:rPr>
-          <w:rFonts w:ascii="Verdana" w:eastAsia="Verdana" w:hAnsi="Verdana" w:cs="Verdana"/>
-          <w:b/>
-          <w:bCs/>
-          <w:sz w:val="16"/>
-          <w:szCs w:val="16"/>
-        </w:rPr>
-        <w:t xml:space="preserve"> Supper Club:</w:t>
+        <w:t>Sabbatum Supper Club:</w:t>
       </w:r>
       <w:r>
         <w:rPr>
@@ -4131,19 +3863,10 @@
         <w:rPr>
           <w:rStyle w:val="bullet-textfs11word-wrap-normal"/>
           <w:rFonts w:ascii="Verdana" w:eastAsia="Verdana" w:hAnsi="Verdana" w:cs="Verdana"/>
-          <w:b w:val="0"/>
           <w:sz w:val="16"/>
           <w:szCs w:val="16"/>
         </w:rPr>
         <w:t xml:space="preserve"> Python, STATA; CRM systems, financial modelling (Wall Street Prep); AI/ML coursework including Hands-on Deep Learning and agentic AI tool exploration</w:t>
-      </w:r>
-      <w:r>
-        <w:rPr>
-          <w:rStyle w:val="bullet-textfs11word-wrap-normal"/>
-          <w:rFonts w:ascii="Verdana" w:eastAsia="Verdana" w:hAnsi="Verdana" w:cs="Verdana"/>
-          <w:sz w:val="16"/>
-          <w:szCs w:val="16"/>
-        </w:rPr>
       </w:r>
     </w:p>
     <w:p>
@@ -4215,6 +3938,7 @@
           <w:sz w:val="16"/>
           <w:szCs w:val="16"/>
         </w:rPr>
+        <w:lastRenderedPageBreak/>
         <w:t xml:space="preserve">Languages: </w:t>
       </w:r>
       <w:r>
@@ -4248,31 +3972,7 @@
           <w:sz w:val="16"/>
           <w:szCs w:val="16"/>
         </w:rPr>
-        <w:t xml:space="preserve">Work </w:t>
-      </w:r>
-      <w:proofErr w:type="spellStart"/>
-      <w:r>
-        <w:rPr>
-          <w:rStyle w:val="fs11fw6undefined"/>
-          <w:rFonts w:ascii="Verdana" w:eastAsia="Verdana" w:hAnsi="Verdana" w:cs="Verdana"/>
-          <w:b/>
-          <w:bCs/>
-          <w:sz w:val="16"/>
-          <w:szCs w:val="16"/>
-        </w:rPr>
-        <w:t>Authorisation</w:t>
-      </w:r>
-      <w:proofErr w:type="spellEnd"/>
-      <w:r>
-        <w:rPr>
-          <w:rStyle w:val="fs11fw6undefined"/>
-          <w:rFonts w:ascii="Verdana" w:eastAsia="Verdana" w:hAnsi="Verdana" w:cs="Verdana"/>
-          <w:b/>
-          <w:bCs/>
-          <w:sz w:val="16"/>
-          <w:szCs w:val="16"/>
-        </w:rPr>
-        <w:t xml:space="preserve">: </w:t>
+        <w:t xml:space="preserve">Work Authorisation: </w:t>
       </w:r>
       <w:r>
         <w:rPr>

</xml_diff>